<commit_message>
Update Alnylam application after confirming real insurance-navigation experience
Josh confirmed 8 years of firsthand experience fighting private-payer
insurers for PT and MRI approvals, tied to a chronic condition requiring
multiple injections and two procedures. This is real, lived prior-
authorization and appeals experience, the actual core mechanic of the
Associate Case Manager role, so it moves the score from 43 (Long shot) to
65 (Solid stretch).

Added the confirmed fact to master-profile.md so it's available for
future healthcare/patient-services applications. Resume summary and
cover letter rewritten to use the real, specific detail (kept the exact
condition/body part general per Josh's privacy) instead of the previous
generic "has been a patient" framing. Match report updated with the
before/after score and reasoning.

Co-Authored-By: Claude Sonnet 5 <noreply@anthropic.com>
Claude-Session: https://claude.ai/code/session_01HeZspKnLVkWbr9yhNEisQZ
</commit_message>
<xml_diff>
--- a/applications/alnylam-associate-case-manager/Rotenberg Cover Letter - Alnylam - Associate Case Manager.docx
+++ b/applications/alnylam-associate-case-manager/Rotenberg Cover Letter - Alnylam - Associate Case Manager.docx
@@ -94,7 +94,7 @@
           <w:b w:val="0"/>
           <w:color w:val="1A1A1A"/>
         </w:rPr>
-        <w:t>I'm drawn to the Associate Case Manager role because I've been a patient inside the healthcare system myself, and I would love to be there helping other patients navigate it. That's a personal motivation, not a talking point, and it's what makes this role different from the account work I've done up to now.</w:t>
+        <w:t>Over the past eight years, a chronic condition requiring multiple injections and two procedures has put me in direct contact with the insurance system more often than I'd like. I've personally fought for approvals on everything from physical therapy appointments to MRIs, which means I understand the prior authorization and appeals process from the patient's side, not as an abstraction but as something I've lived through repeatedly. That's exactly the work this role does for Alnylam's patients, and it's why the Associate Case Manager posting stood out to me.</w:t>
       </w:r>
     </w:p>
     <w:p>
@@ -107,7 +107,7 @@
           <w:b w:val="0"/>
           <w:color w:val="1A1A1A"/>
         </w:rPr>
-        <w:t>What I bring is fifteen years of managing high-volume, detail-critical caseloads for individual clients: at Wix I onboarded 25+ clients a month while holding sales and implementation targets above 100%, and at Solenzo I run concurrent client engagements today, keeping every interaction, timeline, and deliverable documented and current across CRM systems with strict data-hygiene discipline. That's the same rigor a fax queue, a payer call, and an accurate record demand, even though I want to be upfront that my experience is in CRM and account management, not payer-specific systems, medical terminology, or reimbursement processes directly. I learn fast and I'm used to picking up a new domain's specifics on the job.</w:t>
+        <w:t>Professionally, I bring fifteen years of managing high-volume, detail-critical caseloads for individual clients: at Wix I onboarded 25+ clients a month while holding sales and implementation targets above 100%, and at Solenzo I run concurrent client engagements today, keeping every interaction, timeline, and deliverable documented and current across CRM systems with strict data-hygiene discipline. That's the same rigor a fax queue, a payer call, and an accurate record demand. I want to be upfront that my hands-on payer experience is from the patient side, not a prior professional case-management role, and I don't have Medicare/Medicaid-specific or medical billing/coding background. I learn fast and I'm used to picking up a new domain's specifics on the job.</w:t>
       </w:r>
     </w:p>
     <w:p>
@@ -120,7 +120,7 @@
           <w:b w:val="0"/>
           <w:color w:val="1A1A1A"/>
         </w:rPr>
-        <w:t>I'd welcome the chance to talk about how that combination, real operational discipline plus a genuine personal reason to care about the outcome, could work for your Patient Services team.</w:t>
+        <w:t>I'd welcome the chance to talk about how that combination, real operational discipline plus firsthand knowledge of what a patient needs from the other end of that phone call, could work for your Patient Services team.</w:t>
       </w:r>
     </w:p>
     <w:p>

</xml_diff>